<commit_message>
Investigación: versión en PDF con formato más sencillo
</commit_message>
<xml_diff>
--- a/investigacion/RENASER_Investigacion.docx
+++ b/investigacion/RENASER_Investigacion.docx
@@ -4,21 +4,6 @@
   <w:body>
     <w:p>
       <w:pPr>
-        <w:spacing w:after="60"/>
-      </w:pPr>
-      <w:r>
-        <w:rPr>
-          <w:b/>
-          <w:bCs/>
-          <w:color w:val="1F4E79"/>
-          <w:sz w:val="20"/>
-          <w:szCs w:val="20"/>
-        </w:rPr>
-        <w:t xml:space="preserve">RENASER</w:t>
-      </w:r>
-    </w:p>
-    <w:p>
-      <w:pPr>
         <w:pStyle w:val="Title"/>
         <w:spacing w:after="120"/>
       </w:pPr>
@@ -28,25 +13,10 @@
     </w:p>
     <w:p>
       <w:pPr>
-        <w:spacing w:after="120"/>
-      </w:pPr>
-      <w:r>
-        <w:t xml:space="preserve">Investigación — Pregunta 7 · Fernando Montecinos · 14 de octubre de 2026</w:t>
-      </w:r>
-    </w:p>
-    <w:p>
-      <w:pPr>
-        <w:spacing w:after="120"/>
-      </w:pPr>
-      <w:r>
-        <w:rPr>
-          <w:i/>
-          <w:iCs/>
-          <w:color w:val="555555"/>
-          <w:sz w:val="18"/>
-          <w:szCs w:val="18"/>
-        </w:rPr>
-        <w:t xml:space="preserve">Convención: los precios y datos con fuente están citados al final. Las cifras marcadas como "estimación propia" son supuestos razonados, no datos verificados.</w:t>
+        <w:spacing w:after="240"/>
+      </w:pPr>
+      <w:r>
+        <w:t xml:space="preserve">Fernando Montecinos — Pregunta 7 (investigación) — 14 de octubre de 2026</w:t>
       </w:r>
     </w:p>
     <w:p>
@@ -366,12 +336,12 @@
           <w:tcPr>
             <w:tcW w:type="dxa" w:w="2006"/>
             <w:tcBorders>
-              <w:top w:val="single" w:color="BFBFBF" w:sz="4"/>
-              <w:left w:val="single" w:color="BFBFBF" w:sz="4"/>
-              <w:bottom w:val="single" w:color="BFBFBF" w:sz="4"/>
-              <w:right w:val="single" w:color="BFBFBF" w:sz="4"/>
-            </w:tcBorders>
-            <w:shd w:fill="1F4E79" w:color="auto" w:val="clear"/>
+              <w:top w:val="single" w:color="8C8C8C" w:sz="4"/>
+              <w:left w:val="single" w:color="8C8C8C" w:sz="4"/>
+              <w:bottom w:val="single" w:color="8C8C8C" w:sz="4"/>
+              <w:right w:val="single" w:color="8C8C8C" w:sz="4"/>
+            </w:tcBorders>
+            <w:shd w:fill="EDEDED" w:color="auto" w:val="clear"/>
             <w:tcMar>
               <w:top w:type="dxa" w:w="80"/>
               <w:left w:type="dxa" w:w="100"/>
@@ -384,9 +354,8 @@
               <w:rPr>
                 <w:b/>
                 <w:bCs/>
-                <w:color w:val="FFFFFF"/>
-                <w:sz w:val="18"/>
-                <w:szCs w:val="18"/>
+                <w:sz w:val="20"/>
+                <w:szCs w:val="20"/>
               </w:rPr>
               <w:t xml:space="preserve">Criterio</w:t>
             </w:r>
@@ -396,12 +365,12 @@
           <w:tcPr>
             <w:tcW w:type="dxa" w:w="2340"/>
             <w:tcBorders>
-              <w:top w:val="single" w:color="BFBFBF" w:sz="4"/>
-              <w:left w:val="single" w:color="BFBFBF" w:sz="4"/>
-              <w:bottom w:val="single" w:color="BFBFBF" w:sz="4"/>
-              <w:right w:val="single" w:color="BFBFBF" w:sz="4"/>
-            </w:tcBorders>
-            <w:shd w:fill="1F4E79" w:color="auto" w:val="clear"/>
+              <w:top w:val="single" w:color="8C8C8C" w:sz="4"/>
+              <w:left w:val="single" w:color="8C8C8C" w:sz="4"/>
+              <w:bottom w:val="single" w:color="8C8C8C" w:sz="4"/>
+              <w:right w:val="single" w:color="8C8C8C" w:sz="4"/>
+            </w:tcBorders>
+            <w:shd w:fill="EDEDED" w:color="auto" w:val="clear"/>
             <w:tcMar>
               <w:top w:type="dxa" w:w="80"/>
               <w:left w:type="dxa" w:w="100"/>
@@ -414,9 +383,8 @@
               <w:rPr>
                 <w:b/>
                 <w:bCs/>
-                <w:color w:val="FFFFFF"/>
-                <w:sz w:val="18"/>
-                <w:szCs w:val="18"/>
+                <w:sz w:val="20"/>
+                <w:szCs w:val="20"/>
               </w:rPr>
               <w:t xml:space="preserve">A. Automatización</w:t>
             </w:r>
@@ -426,12 +394,12 @@
           <w:tcPr>
             <w:tcW w:type="dxa" w:w="2340"/>
             <w:tcBorders>
-              <w:top w:val="single" w:color="BFBFBF" w:sz="4"/>
-              <w:left w:val="single" w:color="BFBFBF" w:sz="4"/>
-              <w:bottom w:val="single" w:color="BFBFBF" w:sz="4"/>
-              <w:right w:val="single" w:color="BFBFBF" w:sz="4"/>
-            </w:tcBorders>
-            <w:shd w:fill="1F4E79" w:color="auto" w:val="clear"/>
+              <w:top w:val="single" w:color="8C8C8C" w:sz="4"/>
+              <w:left w:val="single" w:color="8C8C8C" w:sz="4"/>
+              <w:bottom w:val="single" w:color="8C8C8C" w:sz="4"/>
+              <w:right w:val="single" w:color="8C8C8C" w:sz="4"/>
+            </w:tcBorders>
+            <w:shd w:fill="EDEDED" w:color="auto" w:val="clear"/>
             <w:tcMar>
               <w:top w:type="dxa" w:w="80"/>
               <w:left w:type="dxa" w:w="100"/>
@@ -444,9 +412,8 @@
               <w:rPr>
                 <w:b/>
                 <w:bCs/>
-                <w:color w:val="FFFFFF"/>
-                <w:sz w:val="18"/>
-                <w:szCs w:val="18"/>
+                <w:sz w:val="20"/>
+                <w:szCs w:val="20"/>
               </w:rPr>
               <w:t xml:space="preserve">B. Agentes de IA</w:t>
             </w:r>
@@ -456,12 +423,12 @@
           <w:tcPr>
             <w:tcW w:type="dxa" w:w="2340"/>
             <w:tcBorders>
-              <w:top w:val="single" w:color="BFBFBF" w:sz="4"/>
-              <w:left w:val="single" w:color="BFBFBF" w:sz="4"/>
-              <w:bottom w:val="single" w:color="BFBFBF" w:sz="4"/>
-              <w:right w:val="single" w:color="BFBFBF" w:sz="4"/>
-            </w:tcBorders>
-            <w:shd w:fill="1F4E79" w:color="auto" w:val="clear"/>
+              <w:top w:val="single" w:color="8C8C8C" w:sz="4"/>
+              <w:left w:val="single" w:color="8C8C8C" w:sz="4"/>
+              <w:bottom w:val="single" w:color="8C8C8C" w:sz="4"/>
+              <w:right w:val="single" w:color="8C8C8C" w:sz="4"/>
+            </w:tcBorders>
+            <w:shd w:fill="EDEDED" w:color="auto" w:val="clear"/>
             <w:tcMar>
               <w:top w:type="dxa" w:w="80"/>
               <w:left w:type="dxa" w:w="100"/>
@@ -474,9 +441,8 @@
               <w:rPr>
                 <w:b/>
                 <w:bCs/>
-                <w:color w:val="FFFFFF"/>
-                <w:sz w:val="18"/>
-                <w:szCs w:val="18"/>
+                <w:sz w:val="20"/>
+                <w:szCs w:val="20"/>
               </w:rPr>
               <w:t xml:space="preserve">C. Externalizar</w:t>
             </w:r>
@@ -488,10 +454,10 @@
           <w:tcPr>
             <w:tcW w:type="dxa" w:w="2006"/>
             <w:tcBorders>
-              <w:top w:val="single" w:color="BFBFBF" w:sz="4"/>
-              <w:left w:val="single" w:color="BFBFBF" w:sz="4"/>
-              <w:bottom w:val="single" w:color="BFBFBF" w:sz="4"/>
-              <w:right w:val="single" w:color="BFBFBF" w:sz="4"/>
+              <w:top w:val="single" w:color="8C8C8C" w:sz="4"/>
+              <w:left w:val="single" w:color="8C8C8C" w:sz="4"/>
+              <w:bottom w:val="single" w:color="8C8C8C" w:sz="4"/>
+              <w:right w:val="single" w:color="8C8C8C" w:sz="4"/>
             </w:tcBorders>
             <w:tcMar>
               <w:top w:type="dxa" w:w="80"/>
@@ -510,10 +476,10 @@
           <w:tcPr>
             <w:tcW w:type="dxa" w:w="2340"/>
             <w:tcBorders>
-              <w:top w:val="single" w:color="BFBFBF" w:sz="4"/>
-              <w:left w:val="single" w:color="BFBFBF" w:sz="4"/>
-              <w:bottom w:val="single" w:color="BFBFBF" w:sz="4"/>
-              <w:right w:val="single" w:color="BFBFBF" w:sz="4"/>
+              <w:top w:val="single" w:color="8C8C8C" w:sz="4"/>
+              <w:left w:val="single" w:color="8C8C8C" w:sz="4"/>
+              <w:bottom w:val="single" w:color="8C8C8C" w:sz="4"/>
+              <w:right w:val="single" w:color="8C8C8C" w:sz="4"/>
             </w:tcBorders>
             <w:tcMar>
               <w:top w:type="dxa" w:w="80"/>
@@ -532,10 +498,10 @@
           <w:tcPr>
             <w:tcW w:type="dxa" w:w="2340"/>
             <w:tcBorders>
-              <w:top w:val="single" w:color="BFBFBF" w:sz="4"/>
-              <w:left w:val="single" w:color="BFBFBF" w:sz="4"/>
-              <w:bottom w:val="single" w:color="BFBFBF" w:sz="4"/>
-              <w:right w:val="single" w:color="BFBFBF" w:sz="4"/>
+              <w:top w:val="single" w:color="8C8C8C" w:sz="4"/>
+              <w:left w:val="single" w:color="8C8C8C" w:sz="4"/>
+              <w:bottom w:val="single" w:color="8C8C8C" w:sz="4"/>
+              <w:right w:val="single" w:color="8C8C8C" w:sz="4"/>
             </w:tcBorders>
             <w:tcMar>
               <w:top w:type="dxa" w:w="80"/>
@@ -554,10 +520,10 @@
           <w:tcPr>
             <w:tcW w:type="dxa" w:w="2340"/>
             <w:tcBorders>
-              <w:top w:val="single" w:color="BFBFBF" w:sz="4"/>
-              <w:left w:val="single" w:color="BFBFBF" w:sz="4"/>
-              <w:bottom w:val="single" w:color="BFBFBF" w:sz="4"/>
-              <w:right w:val="single" w:color="BFBFBF" w:sz="4"/>
+              <w:top w:val="single" w:color="8C8C8C" w:sz="4"/>
+              <w:left w:val="single" w:color="8C8C8C" w:sz="4"/>
+              <w:bottom w:val="single" w:color="8C8C8C" w:sz="4"/>
+              <w:right w:val="single" w:color="8C8C8C" w:sz="4"/>
             </w:tcBorders>
             <w:tcMar>
               <w:top w:type="dxa" w:w="80"/>
@@ -578,10 +544,10 @@
           <w:tcPr>
             <w:tcW w:type="dxa" w:w="2006"/>
             <w:tcBorders>
-              <w:top w:val="single" w:color="BFBFBF" w:sz="4"/>
-              <w:left w:val="single" w:color="BFBFBF" w:sz="4"/>
-              <w:bottom w:val="single" w:color="BFBFBF" w:sz="4"/>
-              <w:right w:val="single" w:color="BFBFBF" w:sz="4"/>
+              <w:top w:val="single" w:color="8C8C8C" w:sz="4"/>
+              <w:left w:val="single" w:color="8C8C8C" w:sz="4"/>
+              <w:bottom w:val="single" w:color="8C8C8C" w:sz="4"/>
+              <w:right w:val="single" w:color="8C8C8C" w:sz="4"/>
             </w:tcBorders>
             <w:tcMar>
               <w:top w:type="dxa" w:w="80"/>
@@ -600,10 +566,10 @@
           <w:tcPr>
             <w:tcW w:type="dxa" w:w="2340"/>
             <w:tcBorders>
-              <w:top w:val="single" w:color="BFBFBF" w:sz="4"/>
-              <w:left w:val="single" w:color="BFBFBF" w:sz="4"/>
-              <w:bottom w:val="single" w:color="BFBFBF" w:sz="4"/>
-              <w:right w:val="single" w:color="BFBFBF" w:sz="4"/>
+              <w:top w:val="single" w:color="8C8C8C" w:sz="4"/>
+              <w:left w:val="single" w:color="8C8C8C" w:sz="4"/>
+              <w:bottom w:val="single" w:color="8C8C8C" w:sz="4"/>
+              <w:right w:val="single" w:color="8C8C8C" w:sz="4"/>
             </w:tcBorders>
             <w:tcMar>
               <w:top w:type="dxa" w:w="80"/>
@@ -622,10 +588,10 @@
           <w:tcPr>
             <w:tcW w:type="dxa" w:w="2340"/>
             <w:tcBorders>
-              <w:top w:val="single" w:color="BFBFBF" w:sz="4"/>
-              <w:left w:val="single" w:color="BFBFBF" w:sz="4"/>
-              <w:bottom w:val="single" w:color="BFBFBF" w:sz="4"/>
-              <w:right w:val="single" w:color="BFBFBF" w:sz="4"/>
+              <w:top w:val="single" w:color="8C8C8C" w:sz="4"/>
+              <w:left w:val="single" w:color="8C8C8C" w:sz="4"/>
+              <w:bottom w:val="single" w:color="8C8C8C" w:sz="4"/>
+              <w:right w:val="single" w:color="8C8C8C" w:sz="4"/>
             </w:tcBorders>
             <w:tcMar>
               <w:top w:type="dxa" w:w="80"/>
@@ -644,10 +610,10 @@
           <w:tcPr>
             <w:tcW w:type="dxa" w:w="2340"/>
             <w:tcBorders>
-              <w:top w:val="single" w:color="BFBFBF" w:sz="4"/>
-              <w:left w:val="single" w:color="BFBFBF" w:sz="4"/>
-              <w:bottom w:val="single" w:color="BFBFBF" w:sz="4"/>
-              <w:right w:val="single" w:color="BFBFBF" w:sz="4"/>
+              <w:top w:val="single" w:color="8C8C8C" w:sz="4"/>
+              <w:left w:val="single" w:color="8C8C8C" w:sz="4"/>
+              <w:bottom w:val="single" w:color="8C8C8C" w:sz="4"/>
+              <w:right w:val="single" w:color="8C8C8C" w:sz="4"/>
             </w:tcBorders>
             <w:tcMar>
               <w:top w:type="dxa" w:w="80"/>
@@ -668,10 +634,10 @@
           <w:tcPr>
             <w:tcW w:type="dxa" w:w="2006"/>
             <w:tcBorders>
-              <w:top w:val="single" w:color="BFBFBF" w:sz="4"/>
-              <w:left w:val="single" w:color="BFBFBF" w:sz="4"/>
-              <w:bottom w:val="single" w:color="BFBFBF" w:sz="4"/>
-              <w:right w:val="single" w:color="BFBFBF" w:sz="4"/>
+              <w:top w:val="single" w:color="8C8C8C" w:sz="4"/>
+              <w:left w:val="single" w:color="8C8C8C" w:sz="4"/>
+              <w:bottom w:val="single" w:color="8C8C8C" w:sz="4"/>
+              <w:right w:val="single" w:color="8C8C8C" w:sz="4"/>
             </w:tcBorders>
             <w:tcMar>
               <w:top w:type="dxa" w:w="80"/>
@@ -690,10 +656,10 @@
           <w:tcPr>
             <w:tcW w:type="dxa" w:w="2340"/>
             <w:tcBorders>
-              <w:top w:val="single" w:color="BFBFBF" w:sz="4"/>
-              <w:left w:val="single" w:color="BFBFBF" w:sz="4"/>
-              <w:bottom w:val="single" w:color="BFBFBF" w:sz="4"/>
-              <w:right w:val="single" w:color="BFBFBF" w:sz="4"/>
+              <w:top w:val="single" w:color="8C8C8C" w:sz="4"/>
+              <w:left w:val="single" w:color="8C8C8C" w:sz="4"/>
+              <w:bottom w:val="single" w:color="8C8C8C" w:sz="4"/>
+              <w:right w:val="single" w:color="8C8C8C" w:sz="4"/>
             </w:tcBorders>
             <w:tcMar>
               <w:top w:type="dxa" w:w="80"/>
@@ -712,10 +678,10 @@
           <w:tcPr>
             <w:tcW w:type="dxa" w:w="2340"/>
             <w:tcBorders>
-              <w:top w:val="single" w:color="BFBFBF" w:sz="4"/>
-              <w:left w:val="single" w:color="BFBFBF" w:sz="4"/>
-              <w:bottom w:val="single" w:color="BFBFBF" w:sz="4"/>
-              <w:right w:val="single" w:color="BFBFBF" w:sz="4"/>
+              <w:top w:val="single" w:color="8C8C8C" w:sz="4"/>
+              <w:left w:val="single" w:color="8C8C8C" w:sz="4"/>
+              <w:bottom w:val="single" w:color="8C8C8C" w:sz="4"/>
+              <w:right w:val="single" w:color="8C8C8C" w:sz="4"/>
             </w:tcBorders>
             <w:tcMar>
               <w:top w:type="dxa" w:w="80"/>
@@ -734,10 +700,10 @@
           <w:tcPr>
             <w:tcW w:type="dxa" w:w="2340"/>
             <w:tcBorders>
-              <w:top w:val="single" w:color="BFBFBF" w:sz="4"/>
-              <w:left w:val="single" w:color="BFBFBF" w:sz="4"/>
-              <w:bottom w:val="single" w:color="BFBFBF" w:sz="4"/>
-              <w:right w:val="single" w:color="BFBFBF" w:sz="4"/>
+              <w:top w:val="single" w:color="8C8C8C" w:sz="4"/>
+              <w:left w:val="single" w:color="8C8C8C" w:sz="4"/>
+              <w:bottom w:val="single" w:color="8C8C8C" w:sz="4"/>
+              <w:right w:val="single" w:color="8C8C8C" w:sz="4"/>
             </w:tcBorders>
             <w:tcMar>
               <w:top w:type="dxa" w:w="80"/>
@@ -758,10 +724,10 @@
           <w:tcPr>
             <w:tcW w:type="dxa" w:w="2006"/>
             <w:tcBorders>
-              <w:top w:val="single" w:color="BFBFBF" w:sz="4"/>
-              <w:left w:val="single" w:color="BFBFBF" w:sz="4"/>
-              <w:bottom w:val="single" w:color="BFBFBF" w:sz="4"/>
-              <w:right w:val="single" w:color="BFBFBF" w:sz="4"/>
+              <w:top w:val="single" w:color="8C8C8C" w:sz="4"/>
+              <w:left w:val="single" w:color="8C8C8C" w:sz="4"/>
+              <w:bottom w:val="single" w:color="8C8C8C" w:sz="4"/>
+              <w:right w:val="single" w:color="8C8C8C" w:sz="4"/>
             </w:tcBorders>
             <w:tcMar>
               <w:top w:type="dxa" w:w="80"/>
@@ -780,10 +746,10 @@
           <w:tcPr>
             <w:tcW w:type="dxa" w:w="2340"/>
             <w:tcBorders>
-              <w:top w:val="single" w:color="BFBFBF" w:sz="4"/>
-              <w:left w:val="single" w:color="BFBFBF" w:sz="4"/>
-              <w:bottom w:val="single" w:color="BFBFBF" w:sz="4"/>
-              <w:right w:val="single" w:color="BFBFBF" w:sz="4"/>
+              <w:top w:val="single" w:color="8C8C8C" w:sz="4"/>
+              <w:left w:val="single" w:color="8C8C8C" w:sz="4"/>
+              <w:bottom w:val="single" w:color="8C8C8C" w:sz="4"/>
+              <w:right w:val="single" w:color="8C8C8C" w:sz="4"/>
             </w:tcBorders>
             <w:tcMar>
               <w:top w:type="dxa" w:w="80"/>
@@ -802,10 +768,10 @@
           <w:tcPr>
             <w:tcW w:type="dxa" w:w="2340"/>
             <w:tcBorders>
-              <w:top w:val="single" w:color="BFBFBF" w:sz="4"/>
-              <w:left w:val="single" w:color="BFBFBF" w:sz="4"/>
-              <w:bottom w:val="single" w:color="BFBFBF" w:sz="4"/>
-              <w:right w:val="single" w:color="BFBFBF" w:sz="4"/>
+              <w:top w:val="single" w:color="8C8C8C" w:sz="4"/>
+              <w:left w:val="single" w:color="8C8C8C" w:sz="4"/>
+              <w:bottom w:val="single" w:color="8C8C8C" w:sz="4"/>
+              <w:right w:val="single" w:color="8C8C8C" w:sz="4"/>
             </w:tcBorders>
             <w:tcMar>
               <w:top w:type="dxa" w:w="80"/>
@@ -824,10 +790,10 @@
           <w:tcPr>
             <w:tcW w:type="dxa" w:w="2340"/>
             <w:tcBorders>
-              <w:top w:val="single" w:color="BFBFBF" w:sz="4"/>
-              <w:left w:val="single" w:color="BFBFBF" w:sz="4"/>
-              <w:bottom w:val="single" w:color="BFBFBF" w:sz="4"/>
-              <w:right w:val="single" w:color="BFBFBF" w:sz="4"/>
+              <w:top w:val="single" w:color="8C8C8C" w:sz="4"/>
+              <w:left w:val="single" w:color="8C8C8C" w:sz="4"/>
+              <w:bottom w:val="single" w:color="8C8C8C" w:sz="4"/>
+              <w:right w:val="single" w:color="8C8C8C" w:sz="4"/>
             </w:tcBorders>
             <w:tcMar>
               <w:top w:type="dxa" w:w="80"/>
@@ -848,10 +814,10 @@
           <w:tcPr>
             <w:tcW w:type="dxa" w:w="2006"/>
             <w:tcBorders>
-              <w:top w:val="single" w:color="BFBFBF" w:sz="4"/>
-              <w:left w:val="single" w:color="BFBFBF" w:sz="4"/>
-              <w:bottom w:val="single" w:color="BFBFBF" w:sz="4"/>
-              <w:right w:val="single" w:color="BFBFBF" w:sz="4"/>
+              <w:top w:val="single" w:color="8C8C8C" w:sz="4"/>
+              <w:left w:val="single" w:color="8C8C8C" w:sz="4"/>
+              <w:bottom w:val="single" w:color="8C8C8C" w:sz="4"/>
+              <w:right w:val="single" w:color="8C8C8C" w:sz="4"/>
             </w:tcBorders>
             <w:tcMar>
               <w:top w:type="dxa" w:w="80"/>
@@ -870,10 +836,10 @@
           <w:tcPr>
             <w:tcW w:type="dxa" w:w="2340"/>
             <w:tcBorders>
-              <w:top w:val="single" w:color="BFBFBF" w:sz="4"/>
-              <w:left w:val="single" w:color="BFBFBF" w:sz="4"/>
-              <w:bottom w:val="single" w:color="BFBFBF" w:sz="4"/>
-              <w:right w:val="single" w:color="BFBFBF" w:sz="4"/>
+              <w:top w:val="single" w:color="8C8C8C" w:sz="4"/>
+              <w:left w:val="single" w:color="8C8C8C" w:sz="4"/>
+              <w:bottom w:val="single" w:color="8C8C8C" w:sz="4"/>
+              <w:right w:val="single" w:color="8C8C8C" w:sz="4"/>
             </w:tcBorders>
             <w:tcMar>
               <w:top w:type="dxa" w:w="80"/>
@@ -892,10 +858,10 @@
           <w:tcPr>
             <w:tcW w:type="dxa" w:w="2340"/>
             <w:tcBorders>
-              <w:top w:val="single" w:color="BFBFBF" w:sz="4"/>
-              <w:left w:val="single" w:color="BFBFBF" w:sz="4"/>
-              <w:bottom w:val="single" w:color="BFBFBF" w:sz="4"/>
-              <w:right w:val="single" w:color="BFBFBF" w:sz="4"/>
+              <w:top w:val="single" w:color="8C8C8C" w:sz="4"/>
+              <w:left w:val="single" w:color="8C8C8C" w:sz="4"/>
+              <w:bottom w:val="single" w:color="8C8C8C" w:sz="4"/>
+              <w:right w:val="single" w:color="8C8C8C" w:sz="4"/>
             </w:tcBorders>
             <w:tcMar>
               <w:top w:type="dxa" w:w="80"/>
@@ -914,10 +880,10 @@
           <w:tcPr>
             <w:tcW w:type="dxa" w:w="2340"/>
             <w:tcBorders>
-              <w:top w:val="single" w:color="BFBFBF" w:sz="4"/>
-              <w:left w:val="single" w:color="BFBFBF" w:sz="4"/>
-              <w:bottom w:val="single" w:color="BFBFBF" w:sz="4"/>
-              <w:right w:val="single" w:color="BFBFBF" w:sz="4"/>
+              <w:top w:val="single" w:color="8C8C8C" w:sz="4"/>
+              <w:left w:val="single" w:color="8C8C8C" w:sz="4"/>
+              <w:bottom w:val="single" w:color="8C8C8C" w:sz="4"/>
+              <w:right w:val="single" w:color="8C8C8C" w:sz="4"/>
             </w:tcBorders>
             <w:tcMar>
               <w:top w:type="dxa" w:w="80"/>
@@ -1007,12 +973,12 @@
           <w:tcPr>
             <w:tcW w:type="dxa" w:w="2200"/>
             <w:tcBorders>
-              <w:top w:val="single" w:color="BFBFBF" w:sz="4"/>
-              <w:left w:val="single" w:color="BFBFBF" w:sz="4"/>
-              <w:bottom w:val="single" w:color="BFBFBF" w:sz="4"/>
-              <w:right w:val="single" w:color="BFBFBF" w:sz="4"/>
-            </w:tcBorders>
-            <w:shd w:fill="1F4E79" w:color="auto" w:val="clear"/>
+              <w:top w:val="single" w:color="8C8C8C" w:sz="4"/>
+              <w:left w:val="single" w:color="8C8C8C" w:sz="4"/>
+              <w:bottom w:val="single" w:color="8C8C8C" w:sz="4"/>
+              <w:right w:val="single" w:color="8C8C8C" w:sz="4"/>
+            </w:tcBorders>
+            <w:shd w:fill="EDEDED" w:color="auto" w:val="clear"/>
             <w:tcMar>
               <w:top w:type="dxa" w:w="80"/>
               <w:left w:type="dxa" w:w="100"/>
@@ -1025,9 +991,8 @@
               <w:rPr>
                 <w:b/>
                 <w:bCs/>
-                <w:color w:val="FFFFFF"/>
-                <w:sz w:val="18"/>
-                <w:szCs w:val="18"/>
+                <w:sz w:val="20"/>
+                <w:szCs w:val="20"/>
               </w:rPr>
               <w:t xml:space="preserve">Concepto</w:t>
             </w:r>
@@ -1037,12 +1002,12 @@
           <w:tcPr>
             <w:tcW w:type="dxa" w:w="4426"/>
             <w:tcBorders>
-              <w:top w:val="single" w:color="BFBFBF" w:sz="4"/>
-              <w:left w:val="single" w:color="BFBFBF" w:sz="4"/>
-              <w:bottom w:val="single" w:color="BFBFBF" w:sz="4"/>
-              <w:right w:val="single" w:color="BFBFBF" w:sz="4"/>
-            </w:tcBorders>
-            <w:shd w:fill="1F4E79" w:color="auto" w:val="clear"/>
+              <w:top w:val="single" w:color="8C8C8C" w:sz="4"/>
+              <w:left w:val="single" w:color="8C8C8C" w:sz="4"/>
+              <w:bottom w:val="single" w:color="8C8C8C" w:sz="4"/>
+              <w:right w:val="single" w:color="8C8C8C" w:sz="4"/>
+            </w:tcBorders>
+            <w:shd w:fill="EDEDED" w:color="auto" w:val="clear"/>
             <w:tcMar>
               <w:top w:type="dxa" w:w="80"/>
               <w:left w:type="dxa" w:w="100"/>
@@ -1055,9 +1020,8 @@
               <w:rPr>
                 <w:b/>
                 <w:bCs/>
-                <w:color w:val="FFFFFF"/>
-                <w:sz w:val="18"/>
-                <w:szCs w:val="18"/>
+                <w:sz w:val="20"/>
+                <w:szCs w:val="20"/>
               </w:rPr>
               <w:t xml:space="preserve">Detalle</w:t>
             </w:r>
@@ -1067,12 +1031,12 @@
           <w:tcPr>
             <w:tcW w:type="dxa" w:w="2400"/>
             <w:tcBorders>
-              <w:top w:val="single" w:color="BFBFBF" w:sz="4"/>
-              <w:left w:val="single" w:color="BFBFBF" w:sz="4"/>
-              <w:bottom w:val="single" w:color="BFBFBF" w:sz="4"/>
-              <w:right w:val="single" w:color="BFBFBF" w:sz="4"/>
-            </w:tcBorders>
-            <w:shd w:fill="1F4E79" w:color="auto" w:val="clear"/>
+              <w:top w:val="single" w:color="8C8C8C" w:sz="4"/>
+              <w:left w:val="single" w:color="8C8C8C" w:sz="4"/>
+              <w:bottom w:val="single" w:color="8C8C8C" w:sz="4"/>
+              <w:right w:val="single" w:color="8C8C8C" w:sz="4"/>
+            </w:tcBorders>
+            <w:shd w:fill="EDEDED" w:color="auto" w:val="clear"/>
             <w:tcMar>
               <w:top w:type="dxa" w:w="80"/>
               <w:left w:type="dxa" w:w="100"/>
@@ -1085,9 +1049,8 @@
               <w:rPr>
                 <w:b/>
                 <w:bCs/>
-                <w:color w:val="FFFFFF"/>
-                <w:sz w:val="18"/>
-                <w:szCs w:val="18"/>
+                <w:sz w:val="20"/>
+                <w:szCs w:val="20"/>
               </w:rPr>
               <w:t xml:space="preserve">Costo aproximado</w:t>
             </w:r>
@@ -1099,10 +1062,10 @@
           <w:tcPr>
             <w:tcW w:type="dxa" w:w="2200"/>
             <w:tcBorders>
-              <w:top w:val="single" w:color="BFBFBF" w:sz="4"/>
-              <w:left w:val="single" w:color="BFBFBF" w:sz="4"/>
-              <w:bottom w:val="single" w:color="BFBFBF" w:sz="4"/>
-              <w:right w:val="single" w:color="BFBFBF" w:sz="4"/>
+              <w:top w:val="single" w:color="8C8C8C" w:sz="4"/>
+              <w:left w:val="single" w:color="8C8C8C" w:sz="4"/>
+              <w:bottom w:val="single" w:color="8C8C8C" w:sz="4"/>
+              <w:right w:val="single" w:color="8C8C8C" w:sz="4"/>
             </w:tcBorders>
             <w:tcMar>
               <w:top w:type="dxa" w:w="80"/>
@@ -1121,10 +1084,10 @@
           <w:tcPr>
             <w:tcW w:type="dxa" w:w="4426"/>
             <w:tcBorders>
-              <w:top w:val="single" w:color="BFBFBF" w:sz="4"/>
-              <w:left w:val="single" w:color="BFBFBF" w:sz="4"/>
-              <w:bottom w:val="single" w:color="BFBFBF" w:sz="4"/>
-              <w:right w:val="single" w:color="BFBFBF" w:sz="4"/>
+              <w:top w:val="single" w:color="8C8C8C" w:sz="4"/>
+              <w:left w:val="single" w:color="8C8C8C" w:sz="4"/>
+              <w:bottom w:val="single" w:color="8C8C8C" w:sz="4"/>
+              <w:right w:val="single" w:color="8C8C8C" w:sz="4"/>
             </w:tcBorders>
             <w:tcMar>
               <w:top w:type="dxa" w:w="80"/>
@@ -1143,10 +1106,10 @@
           <w:tcPr>
             <w:tcW w:type="dxa" w:w="2400"/>
             <w:tcBorders>
-              <w:top w:val="single" w:color="BFBFBF" w:sz="4"/>
-              <w:left w:val="single" w:color="BFBFBF" w:sz="4"/>
-              <w:bottom w:val="single" w:color="BFBFBF" w:sz="4"/>
-              <w:right w:val="single" w:color="BFBFBF" w:sz="4"/>
+              <w:top w:val="single" w:color="8C8C8C" w:sz="4"/>
+              <w:left w:val="single" w:color="8C8C8C" w:sz="4"/>
+              <w:bottom w:val="single" w:color="8C8C8C" w:sz="4"/>
+              <w:right w:val="single" w:color="8C8C8C" w:sz="4"/>
             </w:tcBorders>
             <w:tcMar>
               <w:top w:type="dxa" w:w="80"/>
@@ -1167,10 +1130,10 @@
           <w:tcPr>
             <w:tcW w:type="dxa" w:w="2200"/>
             <w:tcBorders>
-              <w:top w:val="single" w:color="BFBFBF" w:sz="4"/>
-              <w:left w:val="single" w:color="BFBFBF" w:sz="4"/>
-              <w:bottom w:val="single" w:color="BFBFBF" w:sz="4"/>
-              <w:right w:val="single" w:color="BFBFBF" w:sz="4"/>
+              <w:top w:val="single" w:color="8C8C8C" w:sz="4"/>
+              <w:left w:val="single" w:color="8C8C8C" w:sz="4"/>
+              <w:bottom w:val="single" w:color="8C8C8C" w:sz="4"/>
+              <w:right w:val="single" w:color="8C8C8C" w:sz="4"/>
             </w:tcBorders>
             <w:tcMar>
               <w:top w:type="dxa" w:w="80"/>
@@ -1189,10 +1152,10 @@
           <w:tcPr>
             <w:tcW w:type="dxa" w:w="4426"/>
             <w:tcBorders>
-              <w:top w:val="single" w:color="BFBFBF" w:sz="4"/>
-              <w:left w:val="single" w:color="BFBFBF" w:sz="4"/>
-              <w:bottom w:val="single" w:color="BFBFBF" w:sz="4"/>
-              <w:right w:val="single" w:color="BFBFBF" w:sz="4"/>
+              <w:top w:val="single" w:color="8C8C8C" w:sz="4"/>
+              <w:left w:val="single" w:color="8C8C8C" w:sz="4"/>
+              <w:bottom w:val="single" w:color="8C8C8C" w:sz="4"/>
+              <w:right w:val="single" w:color="8C8C8C" w:sz="4"/>
             </w:tcBorders>
             <w:tcMar>
               <w:top w:type="dxa" w:w="80"/>
@@ -1211,10 +1174,10 @@
           <w:tcPr>
             <w:tcW w:type="dxa" w:w="2400"/>
             <w:tcBorders>
-              <w:top w:val="single" w:color="BFBFBF" w:sz="4"/>
-              <w:left w:val="single" w:color="BFBFBF" w:sz="4"/>
-              <w:bottom w:val="single" w:color="BFBFBF" w:sz="4"/>
-              <w:right w:val="single" w:color="BFBFBF" w:sz="4"/>
+              <w:top w:val="single" w:color="8C8C8C" w:sz="4"/>
+              <w:left w:val="single" w:color="8C8C8C" w:sz="4"/>
+              <w:bottom w:val="single" w:color="8C8C8C" w:sz="4"/>
+              <w:right w:val="single" w:color="8C8C8C" w:sz="4"/>
             </w:tcBorders>
             <w:tcMar>
               <w:top w:type="dxa" w:w="80"/>
@@ -1235,10 +1198,10 @@
           <w:tcPr>
             <w:tcW w:type="dxa" w:w="2200"/>
             <w:tcBorders>
-              <w:top w:val="single" w:color="BFBFBF" w:sz="4"/>
-              <w:left w:val="single" w:color="BFBFBF" w:sz="4"/>
-              <w:bottom w:val="single" w:color="BFBFBF" w:sz="4"/>
-              <w:right w:val="single" w:color="BFBFBF" w:sz="4"/>
+              <w:top w:val="single" w:color="8C8C8C" w:sz="4"/>
+              <w:left w:val="single" w:color="8C8C8C" w:sz="4"/>
+              <w:bottom w:val="single" w:color="8C8C8C" w:sz="4"/>
+              <w:right w:val="single" w:color="8C8C8C" w:sz="4"/>
             </w:tcBorders>
             <w:tcMar>
               <w:top w:type="dxa" w:w="80"/>
@@ -1257,10 +1220,10 @@
           <w:tcPr>
             <w:tcW w:type="dxa" w:w="4426"/>
             <w:tcBorders>
-              <w:top w:val="single" w:color="BFBFBF" w:sz="4"/>
-              <w:left w:val="single" w:color="BFBFBF" w:sz="4"/>
-              <w:bottom w:val="single" w:color="BFBFBF" w:sz="4"/>
-              <w:right w:val="single" w:color="BFBFBF" w:sz="4"/>
+              <w:top w:val="single" w:color="8C8C8C" w:sz="4"/>
+              <w:left w:val="single" w:color="8C8C8C" w:sz="4"/>
+              <w:bottom w:val="single" w:color="8C8C8C" w:sz="4"/>
+              <w:right w:val="single" w:color="8C8C8C" w:sz="4"/>
             </w:tcBorders>
             <w:tcMar>
               <w:top w:type="dxa" w:w="80"/>
@@ -1279,10 +1242,10 @@
           <w:tcPr>
             <w:tcW w:type="dxa" w:w="2400"/>
             <w:tcBorders>
-              <w:top w:val="single" w:color="BFBFBF" w:sz="4"/>
-              <w:left w:val="single" w:color="BFBFBF" w:sz="4"/>
-              <w:bottom w:val="single" w:color="BFBFBF" w:sz="4"/>
-              <w:right w:val="single" w:color="BFBFBF" w:sz="4"/>
+              <w:top w:val="single" w:color="8C8C8C" w:sz="4"/>
+              <w:left w:val="single" w:color="8C8C8C" w:sz="4"/>
+              <w:bottom w:val="single" w:color="8C8C8C" w:sz="4"/>
+              <w:right w:val="single" w:color="8C8C8C" w:sz="4"/>
             </w:tcBorders>
             <w:tcMar>
               <w:top w:type="dxa" w:w="80"/>
@@ -1303,10 +1266,10 @@
           <w:tcPr>
             <w:tcW w:type="dxa" w:w="2200"/>
             <w:tcBorders>
-              <w:top w:val="single" w:color="BFBFBF" w:sz="4"/>
-              <w:left w:val="single" w:color="BFBFBF" w:sz="4"/>
-              <w:bottom w:val="single" w:color="BFBFBF" w:sz="4"/>
-              <w:right w:val="single" w:color="BFBFBF" w:sz="4"/>
+              <w:top w:val="single" w:color="8C8C8C" w:sz="4"/>
+              <w:left w:val="single" w:color="8C8C8C" w:sz="4"/>
+              <w:bottom w:val="single" w:color="8C8C8C" w:sz="4"/>
+              <w:right w:val="single" w:color="8C8C8C" w:sz="4"/>
             </w:tcBorders>
             <w:tcMar>
               <w:top w:type="dxa" w:w="80"/>
@@ -1325,10 +1288,10 @@
           <w:tcPr>
             <w:tcW w:type="dxa" w:w="4426"/>
             <w:tcBorders>
-              <w:top w:val="single" w:color="BFBFBF" w:sz="4"/>
-              <w:left w:val="single" w:color="BFBFBF" w:sz="4"/>
-              <w:bottom w:val="single" w:color="BFBFBF" w:sz="4"/>
-              <w:right w:val="single" w:color="BFBFBF" w:sz="4"/>
+              <w:top w:val="single" w:color="8C8C8C" w:sz="4"/>
+              <w:left w:val="single" w:color="8C8C8C" w:sz="4"/>
+              <w:bottom w:val="single" w:color="8C8C8C" w:sz="4"/>
+              <w:right w:val="single" w:color="8C8C8C" w:sz="4"/>
             </w:tcBorders>
             <w:tcMar>
               <w:top w:type="dxa" w:w="80"/>
@@ -1347,10 +1310,10 @@
           <w:tcPr>
             <w:tcW w:type="dxa" w:w="2400"/>
             <w:tcBorders>
-              <w:top w:val="single" w:color="BFBFBF" w:sz="4"/>
-              <w:left w:val="single" w:color="BFBFBF" w:sz="4"/>
-              <w:bottom w:val="single" w:color="BFBFBF" w:sz="4"/>
-              <w:right w:val="single" w:color="BFBFBF" w:sz="4"/>
+              <w:top w:val="single" w:color="8C8C8C" w:sz="4"/>
+              <w:left w:val="single" w:color="8C8C8C" w:sz="4"/>
+              <w:bottom w:val="single" w:color="8C8C8C" w:sz="4"/>
+              <w:right w:val="single" w:color="8C8C8C" w:sz="4"/>
             </w:tcBorders>
             <w:tcMar>
               <w:top w:type="dxa" w:w="80"/>
@@ -1371,10 +1334,10 @@
           <w:tcPr>
             <w:tcW w:type="dxa" w:w="2200"/>
             <w:tcBorders>
-              <w:top w:val="single" w:color="BFBFBF" w:sz="4"/>
-              <w:left w:val="single" w:color="BFBFBF" w:sz="4"/>
-              <w:bottom w:val="single" w:color="BFBFBF" w:sz="4"/>
-              <w:right w:val="single" w:color="BFBFBF" w:sz="4"/>
+              <w:top w:val="single" w:color="8C8C8C" w:sz="4"/>
+              <w:left w:val="single" w:color="8C8C8C" w:sz="4"/>
+              <w:bottom w:val="single" w:color="8C8C8C" w:sz="4"/>
+              <w:right w:val="single" w:color="8C8C8C" w:sz="4"/>
             </w:tcBorders>
             <w:tcMar>
               <w:top w:type="dxa" w:w="80"/>
@@ -1393,10 +1356,10 @@
           <w:tcPr>
             <w:tcW w:type="dxa" w:w="4426"/>
             <w:tcBorders>
-              <w:top w:val="single" w:color="BFBFBF" w:sz="4"/>
-              <w:left w:val="single" w:color="BFBFBF" w:sz="4"/>
-              <w:bottom w:val="single" w:color="BFBFBF" w:sz="4"/>
-              <w:right w:val="single" w:color="BFBFBF" w:sz="4"/>
+              <w:top w:val="single" w:color="8C8C8C" w:sz="4"/>
+              <w:left w:val="single" w:color="8C8C8C" w:sz="4"/>
+              <w:bottom w:val="single" w:color="8C8C8C" w:sz="4"/>
+              <w:right w:val="single" w:color="8C8C8C" w:sz="4"/>
             </w:tcBorders>
             <w:tcMar>
               <w:top w:type="dxa" w:w="80"/>
@@ -1415,10 +1378,10 @@
           <w:tcPr>
             <w:tcW w:type="dxa" w:w="2400"/>
             <w:tcBorders>
-              <w:top w:val="single" w:color="BFBFBF" w:sz="4"/>
-              <w:left w:val="single" w:color="BFBFBF" w:sz="4"/>
-              <w:bottom w:val="single" w:color="BFBFBF" w:sz="4"/>
-              <w:right w:val="single" w:color="BFBFBF" w:sz="4"/>
+              <w:top w:val="single" w:color="8C8C8C" w:sz="4"/>
+              <w:left w:val="single" w:color="8C8C8C" w:sz="4"/>
+              <w:bottom w:val="single" w:color="8C8C8C" w:sz="4"/>
+              <w:right w:val="single" w:color="8C8C8C" w:sz="4"/>
             </w:tcBorders>
             <w:tcMar>
               <w:top w:type="dxa" w:w="80"/>
@@ -1439,10 +1402,10 @@
           <w:tcPr>
             <w:tcW w:type="dxa" w:w="2200"/>
             <w:tcBorders>
-              <w:top w:val="single" w:color="BFBFBF" w:sz="4"/>
-              <w:left w:val="single" w:color="BFBFBF" w:sz="4"/>
-              <w:bottom w:val="single" w:color="BFBFBF" w:sz="4"/>
-              <w:right w:val="single" w:color="BFBFBF" w:sz="4"/>
+              <w:top w:val="single" w:color="8C8C8C" w:sz="4"/>
+              <w:left w:val="single" w:color="8C8C8C" w:sz="4"/>
+              <w:bottom w:val="single" w:color="8C8C8C" w:sz="4"/>
+              <w:right w:val="single" w:color="8C8C8C" w:sz="4"/>
             </w:tcBorders>
             <w:tcMar>
               <w:top w:type="dxa" w:w="80"/>
@@ -1461,10 +1424,10 @@
           <w:tcPr>
             <w:tcW w:type="dxa" w:w="4426"/>
             <w:tcBorders>
-              <w:top w:val="single" w:color="BFBFBF" w:sz="4"/>
-              <w:left w:val="single" w:color="BFBFBF" w:sz="4"/>
-              <w:bottom w:val="single" w:color="BFBFBF" w:sz="4"/>
-              <w:right w:val="single" w:color="BFBFBF" w:sz="4"/>
+              <w:top w:val="single" w:color="8C8C8C" w:sz="4"/>
+              <w:left w:val="single" w:color="8C8C8C" w:sz="4"/>
+              <w:bottom w:val="single" w:color="8C8C8C" w:sz="4"/>
+              <w:right w:val="single" w:color="8C8C8C" w:sz="4"/>
             </w:tcBorders>
             <w:tcMar>
               <w:top w:type="dxa" w:w="80"/>
@@ -1483,10 +1446,10 @@
           <w:tcPr>
             <w:tcW w:type="dxa" w:w="2400"/>
             <w:tcBorders>
-              <w:top w:val="single" w:color="BFBFBF" w:sz="4"/>
-              <w:left w:val="single" w:color="BFBFBF" w:sz="4"/>
-              <w:bottom w:val="single" w:color="BFBFBF" w:sz="4"/>
-              <w:right w:val="single" w:color="BFBFBF" w:sz="4"/>
+              <w:top w:val="single" w:color="8C8C8C" w:sz="4"/>
+              <w:left w:val="single" w:color="8C8C8C" w:sz="4"/>
+              <w:bottom w:val="single" w:color="8C8C8C" w:sz="4"/>
+              <w:right w:val="single" w:color="8C8C8C" w:sz="4"/>
             </w:tcBorders>
             <w:tcMar>
               <w:top w:type="dxa" w:w="80"/>
@@ -1537,12 +1500,12 @@
           <w:tcPr>
             <w:tcW w:type="dxa" w:w="700"/>
             <w:tcBorders>
-              <w:top w:val="single" w:color="BFBFBF" w:sz="4"/>
-              <w:left w:val="single" w:color="BFBFBF" w:sz="4"/>
-              <w:bottom w:val="single" w:color="BFBFBF" w:sz="4"/>
-              <w:right w:val="single" w:color="BFBFBF" w:sz="4"/>
-            </w:tcBorders>
-            <w:shd w:fill="1F4E79" w:color="auto" w:val="clear"/>
+              <w:top w:val="single" w:color="8C8C8C" w:sz="4"/>
+              <w:left w:val="single" w:color="8C8C8C" w:sz="4"/>
+              <w:bottom w:val="single" w:color="8C8C8C" w:sz="4"/>
+              <w:right w:val="single" w:color="8C8C8C" w:sz="4"/>
+            </w:tcBorders>
+            <w:shd w:fill="EDEDED" w:color="auto" w:val="clear"/>
             <w:tcMar>
               <w:top w:type="dxa" w:w="80"/>
               <w:left w:type="dxa" w:w="100"/>
@@ -1555,9 +1518,8 @@
               <w:rPr>
                 <w:b/>
                 <w:bCs/>
-                <w:color w:val="FFFFFF"/>
-                <w:sz w:val="18"/>
-                <w:szCs w:val="18"/>
+                <w:sz w:val="20"/>
+                <w:szCs w:val="20"/>
               </w:rPr>
               <w:t xml:space="preserve">Día</w:t>
             </w:r>
@@ -1567,12 +1529,12 @@
           <w:tcPr>
             <w:tcW w:type="dxa" w:w="5626"/>
             <w:tcBorders>
-              <w:top w:val="single" w:color="BFBFBF" w:sz="4"/>
-              <w:left w:val="single" w:color="BFBFBF" w:sz="4"/>
-              <w:bottom w:val="single" w:color="BFBFBF" w:sz="4"/>
-              <w:right w:val="single" w:color="BFBFBF" w:sz="4"/>
-            </w:tcBorders>
-            <w:shd w:fill="1F4E79" w:color="auto" w:val="clear"/>
+              <w:top w:val="single" w:color="8C8C8C" w:sz="4"/>
+              <w:left w:val="single" w:color="8C8C8C" w:sz="4"/>
+              <w:bottom w:val="single" w:color="8C8C8C" w:sz="4"/>
+              <w:right w:val="single" w:color="8C8C8C" w:sz="4"/>
+            </w:tcBorders>
+            <w:shd w:fill="EDEDED" w:color="auto" w:val="clear"/>
             <w:tcMar>
               <w:top w:type="dxa" w:w="80"/>
               <w:left w:type="dxa" w:w="100"/>
@@ -1585,9 +1547,8 @@
               <w:rPr>
                 <w:b/>
                 <w:bCs/>
-                <w:color w:val="FFFFFF"/>
-                <w:sz w:val="18"/>
-                <w:szCs w:val="18"/>
+                <w:sz w:val="20"/>
+                <w:szCs w:val="20"/>
               </w:rPr>
               <w:t xml:space="preserve">Entregable</w:t>
             </w:r>
@@ -1597,12 +1558,12 @@
           <w:tcPr>
             <w:tcW w:type="dxa" w:w="2700"/>
             <w:tcBorders>
-              <w:top w:val="single" w:color="BFBFBF" w:sz="4"/>
-              <w:left w:val="single" w:color="BFBFBF" w:sz="4"/>
-              <w:bottom w:val="single" w:color="BFBFBF" w:sz="4"/>
-              <w:right w:val="single" w:color="BFBFBF" w:sz="4"/>
-            </w:tcBorders>
-            <w:shd w:fill="1F4E79" w:color="auto" w:val="clear"/>
+              <w:top w:val="single" w:color="8C8C8C" w:sz="4"/>
+              <w:left w:val="single" w:color="8C8C8C" w:sz="4"/>
+              <w:bottom w:val="single" w:color="8C8C8C" w:sz="4"/>
+              <w:right w:val="single" w:color="8C8C8C" w:sz="4"/>
+            </w:tcBorders>
+            <w:shd w:fill="EDEDED" w:color="auto" w:val="clear"/>
             <w:tcMar>
               <w:top w:type="dxa" w:w="80"/>
               <w:left w:type="dxa" w:w="100"/>
@@ -1615,9 +1576,8 @@
               <w:rPr>
                 <w:b/>
                 <w:bCs/>
-                <w:color w:val="FFFFFF"/>
-                <w:sz w:val="18"/>
-                <w:szCs w:val="18"/>
+                <w:sz w:val="20"/>
+                <w:szCs w:val="20"/>
               </w:rPr>
               <w:t xml:space="preserve">Responsable</w:t>
             </w:r>
@@ -1629,10 +1589,10 @@
           <w:tcPr>
             <w:tcW w:type="dxa" w:w="700"/>
             <w:tcBorders>
-              <w:top w:val="single" w:color="BFBFBF" w:sz="4"/>
-              <w:left w:val="single" w:color="BFBFBF" w:sz="4"/>
-              <w:bottom w:val="single" w:color="BFBFBF" w:sz="4"/>
-              <w:right w:val="single" w:color="BFBFBF" w:sz="4"/>
+              <w:top w:val="single" w:color="8C8C8C" w:sz="4"/>
+              <w:left w:val="single" w:color="8C8C8C" w:sz="4"/>
+              <w:bottom w:val="single" w:color="8C8C8C" w:sz="4"/>
+              <w:right w:val="single" w:color="8C8C8C" w:sz="4"/>
             </w:tcBorders>
             <w:tcMar>
               <w:top w:type="dxa" w:w="80"/>
@@ -1651,10 +1611,10 @@
           <w:tcPr>
             <w:tcW w:type="dxa" w:w="5626"/>
             <w:tcBorders>
-              <w:top w:val="single" w:color="BFBFBF" w:sz="4"/>
-              <w:left w:val="single" w:color="BFBFBF" w:sz="4"/>
-              <w:bottom w:val="single" w:color="BFBFBF" w:sz="4"/>
-              <w:right w:val="single" w:color="BFBFBF" w:sz="4"/>
+              <w:top w:val="single" w:color="8C8C8C" w:sz="4"/>
+              <w:left w:val="single" w:color="8C8C8C" w:sz="4"/>
+              <w:bottom w:val="single" w:color="8C8C8C" w:sz="4"/>
+              <w:right w:val="single" w:color="8C8C8C" w:sz="4"/>
             </w:tcBorders>
             <w:tcMar>
               <w:top w:type="dxa" w:w="80"/>
@@ -1673,10 +1633,10 @@
           <w:tcPr>
             <w:tcW w:type="dxa" w:w="2700"/>
             <w:tcBorders>
-              <w:top w:val="single" w:color="BFBFBF" w:sz="4"/>
-              <w:left w:val="single" w:color="BFBFBF" w:sz="4"/>
-              <w:bottom w:val="single" w:color="BFBFBF" w:sz="4"/>
-              <w:right w:val="single" w:color="BFBFBF" w:sz="4"/>
+              <w:top w:val="single" w:color="8C8C8C" w:sz="4"/>
+              <w:left w:val="single" w:color="8C8C8C" w:sz="4"/>
+              <w:bottom w:val="single" w:color="8C8C8C" w:sz="4"/>
+              <w:right w:val="single" w:color="8C8C8C" w:sz="4"/>
             </w:tcBorders>
             <w:tcMar>
               <w:top w:type="dxa" w:w="80"/>
@@ -1697,10 +1657,10 @@
           <w:tcPr>
             <w:tcW w:type="dxa" w:w="700"/>
             <w:tcBorders>
-              <w:top w:val="single" w:color="BFBFBF" w:sz="4"/>
-              <w:left w:val="single" w:color="BFBFBF" w:sz="4"/>
-              <w:bottom w:val="single" w:color="BFBFBF" w:sz="4"/>
-              <w:right w:val="single" w:color="BFBFBF" w:sz="4"/>
+              <w:top w:val="single" w:color="8C8C8C" w:sz="4"/>
+              <w:left w:val="single" w:color="8C8C8C" w:sz="4"/>
+              <w:bottom w:val="single" w:color="8C8C8C" w:sz="4"/>
+              <w:right w:val="single" w:color="8C8C8C" w:sz="4"/>
             </w:tcBorders>
             <w:tcMar>
               <w:top w:type="dxa" w:w="80"/>
@@ -1719,10 +1679,10 @@
           <w:tcPr>
             <w:tcW w:type="dxa" w:w="5626"/>
             <w:tcBorders>
-              <w:top w:val="single" w:color="BFBFBF" w:sz="4"/>
-              <w:left w:val="single" w:color="BFBFBF" w:sz="4"/>
-              <w:bottom w:val="single" w:color="BFBFBF" w:sz="4"/>
-              <w:right w:val="single" w:color="BFBFBF" w:sz="4"/>
+              <w:top w:val="single" w:color="8C8C8C" w:sz="4"/>
+              <w:left w:val="single" w:color="8C8C8C" w:sz="4"/>
+              <w:bottom w:val="single" w:color="8C8C8C" w:sz="4"/>
+              <w:right w:val="single" w:color="8C8C8C" w:sz="4"/>
             </w:tcBorders>
             <w:tcMar>
               <w:top w:type="dxa" w:w="80"/>
@@ -1741,10 +1701,10 @@
           <w:tcPr>
             <w:tcW w:type="dxa" w:w="2700"/>
             <w:tcBorders>
-              <w:top w:val="single" w:color="BFBFBF" w:sz="4"/>
-              <w:left w:val="single" w:color="BFBFBF" w:sz="4"/>
-              <w:bottom w:val="single" w:color="BFBFBF" w:sz="4"/>
-              <w:right w:val="single" w:color="BFBFBF" w:sz="4"/>
+              <w:top w:val="single" w:color="8C8C8C" w:sz="4"/>
+              <w:left w:val="single" w:color="8C8C8C" w:sz="4"/>
+              <w:bottom w:val="single" w:color="8C8C8C" w:sz="4"/>
+              <w:right w:val="single" w:color="8C8C8C" w:sz="4"/>
             </w:tcBorders>
             <w:tcMar>
               <w:top w:type="dxa" w:w="80"/>
@@ -1765,10 +1725,10 @@
           <w:tcPr>
             <w:tcW w:type="dxa" w:w="700"/>
             <w:tcBorders>
-              <w:top w:val="single" w:color="BFBFBF" w:sz="4"/>
-              <w:left w:val="single" w:color="BFBFBF" w:sz="4"/>
-              <w:bottom w:val="single" w:color="BFBFBF" w:sz="4"/>
-              <w:right w:val="single" w:color="BFBFBF" w:sz="4"/>
+              <w:top w:val="single" w:color="8C8C8C" w:sz="4"/>
+              <w:left w:val="single" w:color="8C8C8C" w:sz="4"/>
+              <w:bottom w:val="single" w:color="8C8C8C" w:sz="4"/>
+              <w:right w:val="single" w:color="8C8C8C" w:sz="4"/>
             </w:tcBorders>
             <w:tcMar>
               <w:top w:type="dxa" w:w="80"/>
@@ -1787,10 +1747,10 @@
           <w:tcPr>
             <w:tcW w:type="dxa" w:w="5626"/>
             <w:tcBorders>
-              <w:top w:val="single" w:color="BFBFBF" w:sz="4"/>
-              <w:left w:val="single" w:color="BFBFBF" w:sz="4"/>
-              <w:bottom w:val="single" w:color="BFBFBF" w:sz="4"/>
-              <w:right w:val="single" w:color="BFBFBF" w:sz="4"/>
+              <w:top w:val="single" w:color="8C8C8C" w:sz="4"/>
+              <w:left w:val="single" w:color="8C8C8C" w:sz="4"/>
+              <w:bottom w:val="single" w:color="8C8C8C" w:sz="4"/>
+              <w:right w:val="single" w:color="8C8C8C" w:sz="4"/>
             </w:tcBorders>
             <w:tcMar>
               <w:top w:type="dxa" w:w="80"/>
@@ -1809,10 +1769,10 @@
           <w:tcPr>
             <w:tcW w:type="dxa" w:w="2700"/>
             <w:tcBorders>
-              <w:top w:val="single" w:color="BFBFBF" w:sz="4"/>
-              <w:left w:val="single" w:color="BFBFBF" w:sz="4"/>
-              <w:bottom w:val="single" w:color="BFBFBF" w:sz="4"/>
-              <w:right w:val="single" w:color="BFBFBF" w:sz="4"/>
+              <w:top w:val="single" w:color="8C8C8C" w:sz="4"/>
+              <w:left w:val="single" w:color="8C8C8C" w:sz="4"/>
+              <w:bottom w:val="single" w:color="8C8C8C" w:sz="4"/>
+              <w:right w:val="single" w:color="8C8C8C" w:sz="4"/>
             </w:tcBorders>
             <w:tcMar>
               <w:top w:type="dxa" w:w="80"/>
@@ -1833,10 +1793,10 @@
           <w:tcPr>
             <w:tcW w:type="dxa" w:w="700"/>
             <w:tcBorders>
-              <w:top w:val="single" w:color="BFBFBF" w:sz="4"/>
-              <w:left w:val="single" w:color="BFBFBF" w:sz="4"/>
-              <w:bottom w:val="single" w:color="BFBFBF" w:sz="4"/>
-              <w:right w:val="single" w:color="BFBFBF" w:sz="4"/>
+              <w:top w:val="single" w:color="8C8C8C" w:sz="4"/>
+              <w:left w:val="single" w:color="8C8C8C" w:sz="4"/>
+              <w:bottom w:val="single" w:color="8C8C8C" w:sz="4"/>
+              <w:right w:val="single" w:color="8C8C8C" w:sz="4"/>
             </w:tcBorders>
             <w:tcMar>
               <w:top w:type="dxa" w:w="80"/>
@@ -1855,10 +1815,10 @@
           <w:tcPr>
             <w:tcW w:type="dxa" w:w="5626"/>
             <w:tcBorders>
-              <w:top w:val="single" w:color="BFBFBF" w:sz="4"/>
-              <w:left w:val="single" w:color="BFBFBF" w:sz="4"/>
-              <w:bottom w:val="single" w:color="BFBFBF" w:sz="4"/>
-              <w:right w:val="single" w:color="BFBFBF" w:sz="4"/>
+              <w:top w:val="single" w:color="8C8C8C" w:sz="4"/>
+              <w:left w:val="single" w:color="8C8C8C" w:sz="4"/>
+              <w:bottom w:val="single" w:color="8C8C8C" w:sz="4"/>
+              <w:right w:val="single" w:color="8C8C8C" w:sz="4"/>
             </w:tcBorders>
             <w:tcMar>
               <w:top w:type="dxa" w:w="80"/>
@@ -1877,10 +1837,10 @@
           <w:tcPr>
             <w:tcW w:type="dxa" w:w="2700"/>
             <w:tcBorders>
-              <w:top w:val="single" w:color="BFBFBF" w:sz="4"/>
-              <w:left w:val="single" w:color="BFBFBF" w:sz="4"/>
-              <w:bottom w:val="single" w:color="BFBFBF" w:sz="4"/>
-              <w:right w:val="single" w:color="BFBFBF" w:sz="4"/>
+              <w:top w:val="single" w:color="8C8C8C" w:sz="4"/>
+              <w:left w:val="single" w:color="8C8C8C" w:sz="4"/>
+              <w:bottom w:val="single" w:color="8C8C8C" w:sz="4"/>
+              <w:right w:val="single" w:color="8C8C8C" w:sz="4"/>
             </w:tcBorders>
             <w:tcMar>
               <w:top w:type="dxa" w:w="80"/>
@@ -1901,10 +1861,10 @@
           <w:tcPr>
             <w:tcW w:type="dxa" w:w="700"/>
             <w:tcBorders>
-              <w:top w:val="single" w:color="BFBFBF" w:sz="4"/>
-              <w:left w:val="single" w:color="BFBFBF" w:sz="4"/>
-              <w:bottom w:val="single" w:color="BFBFBF" w:sz="4"/>
-              <w:right w:val="single" w:color="BFBFBF" w:sz="4"/>
+              <w:top w:val="single" w:color="8C8C8C" w:sz="4"/>
+              <w:left w:val="single" w:color="8C8C8C" w:sz="4"/>
+              <w:bottom w:val="single" w:color="8C8C8C" w:sz="4"/>
+              <w:right w:val="single" w:color="8C8C8C" w:sz="4"/>
             </w:tcBorders>
             <w:tcMar>
               <w:top w:type="dxa" w:w="80"/>
@@ -1923,10 +1883,10 @@
           <w:tcPr>
             <w:tcW w:type="dxa" w:w="5626"/>
             <w:tcBorders>
-              <w:top w:val="single" w:color="BFBFBF" w:sz="4"/>
-              <w:left w:val="single" w:color="BFBFBF" w:sz="4"/>
-              <w:bottom w:val="single" w:color="BFBFBF" w:sz="4"/>
-              <w:right w:val="single" w:color="BFBFBF" w:sz="4"/>
+              <w:top w:val="single" w:color="8C8C8C" w:sz="4"/>
+              <w:left w:val="single" w:color="8C8C8C" w:sz="4"/>
+              <w:bottom w:val="single" w:color="8C8C8C" w:sz="4"/>
+              <w:right w:val="single" w:color="8C8C8C" w:sz="4"/>
             </w:tcBorders>
             <w:tcMar>
               <w:top w:type="dxa" w:w="80"/>
@@ -1945,10 +1905,10 @@
           <w:tcPr>
             <w:tcW w:type="dxa" w:w="2700"/>
             <w:tcBorders>
-              <w:top w:val="single" w:color="BFBFBF" w:sz="4"/>
-              <w:left w:val="single" w:color="BFBFBF" w:sz="4"/>
-              <w:bottom w:val="single" w:color="BFBFBF" w:sz="4"/>
-              <w:right w:val="single" w:color="BFBFBF" w:sz="4"/>
+              <w:top w:val="single" w:color="8C8C8C" w:sz="4"/>
+              <w:left w:val="single" w:color="8C8C8C" w:sz="4"/>
+              <w:bottom w:val="single" w:color="8C8C8C" w:sz="4"/>
+              <w:right w:val="single" w:color="8C8C8C" w:sz="4"/>
             </w:tcBorders>
             <w:tcMar>
               <w:top w:type="dxa" w:w="80"/>
@@ -1969,10 +1929,10 @@
           <w:tcPr>
             <w:tcW w:type="dxa" w:w="700"/>
             <w:tcBorders>
-              <w:top w:val="single" w:color="BFBFBF" w:sz="4"/>
-              <w:left w:val="single" w:color="BFBFBF" w:sz="4"/>
-              <w:bottom w:val="single" w:color="BFBFBF" w:sz="4"/>
-              <w:right w:val="single" w:color="BFBFBF" w:sz="4"/>
+              <w:top w:val="single" w:color="8C8C8C" w:sz="4"/>
+              <w:left w:val="single" w:color="8C8C8C" w:sz="4"/>
+              <w:bottom w:val="single" w:color="8C8C8C" w:sz="4"/>
+              <w:right w:val="single" w:color="8C8C8C" w:sz="4"/>
             </w:tcBorders>
             <w:tcMar>
               <w:top w:type="dxa" w:w="80"/>
@@ -1991,10 +1951,10 @@
           <w:tcPr>
             <w:tcW w:type="dxa" w:w="5626"/>
             <w:tcBorders>
-              <w:top w:val="single" w:color="BFBFBF" w:sz="4"/>
-              <w:left w:val="single" w:color="BFBFBF" w:sz="4"/>
-              <w:bottom w:val="single" w:color="BFBFBF" w:sz="4"/>
-              <w:right w:val="single" w:color="BFBFBF" w:sz="4"/>
+              <w:top w:val="single" w:color="8C8C8C" w:sz="4"/>
+              <w:left w:val="single" w:color="8C8C8C" w:sz="4"/>
+              <w:bottom w:val="single" w:color="8C8C8C" w:sz="4"/>
+              <w:right w:val="single" w:color="8C8C8C" w:sz="4"/>
             </w:tcBorders>
             <w:tcMar>
               <w:top w:type="dxa" w:w="80"/>
@@ -2013,10 +1973,10 @@
           <w:tcPr>
             <w:tcW w:type="dxa" w:w="2700"/>
             <w:tcBorders>
-              <w:top w:val="single" w:color="BFBFBF" w:sz="4"/>
-              <w:left w:val="single" w:color="BFBFBF" w:sz="4"/>
-              <w:bottom w:val="single" w:color="BFBFBF" w:sz="4"/>
-              <w:right w:val="single" w:color="BFBFBF" w:sz="4"/>
+              <w:top w:val="single" w:color="8C8C8C" w:sz="4"/>
+              <w:left w:val="single" w:color="8C8C8C" w:sz="4"/>
+              <w:bottom w:val="single" w:color="8C8C8C" w:sz="4"/>
+              <w:right w:val="single" w:color="8C8C8C" w:sz="4"/>
             </w:tcBorders>
             <w:tcMar>
               <w:top w:type="dxa" w:w="80"/>
@@ -2037,10 +1997,10 @@
           <w:tcPr>
             <w:tcW w:type="dxa" w:w="700"/>
             <w:tcBorders>
-              <w:top w:val="single" w:color="BFBFBF" w:sz="4"/>
-              <w:left w:val="single" w:color="BFBFBF" w:sz="4"/>
-              <w:bottom w:val="single" w:color="BFBFBF" w:sz="4"/>
-              <w:right w:val="single" w:color="BFBFBF" w:sz="4"/>
+              <w:top w:val="single" w:color="8C8C8C" w:sz="4"/>
+              <w:left w:val="single" w:color="8C8C8C" w:sz="4"/>
+              <w:bottom w:val="single" w:color="8C8C8C" w:sz="4"/>
+              <w:right w:val="single" w:color="8C8C8C" w:sz="4"/>
             </w:tcBorders>
             <w:tcMar>
               <w:top w:type="dxa" w:w="80"/>
@@ -2059,10 +2019,10 @@
           <w:tcPr>
             <w:tcW w:type="dxa" w:w="5626"/>
             <w:tcBorders>
-              <w:top w:val="single" w:color="BFBFBF" w:sz="4"/>
-              <w:left w:val="single" w:color="BFBFBF" w:sz="4"/>
-              <w:bottom w:val="single" w:color="BFBFBF" w:sz="4"/>
-              <w:right w:val="single" w:color="BFBFBF" w:sz="4"/>
+              <w:top w:val="single" w:color="8C8C8C" w:sz="4"/>
+              <w:left w:val="single" w:color="8C8C8C" w:sz="4"/>
+              <w:bottom w:val="single" w:color="8C8C8C" w:sz="4"/>
+              <w:right w:val="single" w:color="8C8C8C" w:sz="4"/>
             </w:tcBorders>
             <w:tcMar>
               <w:top w:type="dxa" w:w="80"/>
@@ -2081,10 +2041,10 @@
           <w:tcPr>
             <w:tcW w:type="dxa" w:w="2700"/>
             <w:tcBorders>
-              <w:top w:val="single" w:color="BFBFBF" w:sz="4"/>
-              <w:left w:val="single" w:color="BFBFBF" w:sz="4"/>
-              <w:bottom w:val="single" w:color="BFBFBF" w:sz="4"/>
-              <w:right w:val="single" w:color="BFBFBF" w:sz="4"/>
+              <w:top w:val="single" w:color="8C8C8C" w:sz="4"/>
+              <w:left w:val="single" w:color="8C8C8C" w:sz="4"/>
+              <w:bottom w:val="single" w:color="8C8C8C" w:sz="4"/>
+              <w:right w:val="single" w:color="8C8C8C" w:sz="4"/>
             </w:tcBorders>
             <w:tcMar>
               <w:top w:type="dxa" w:w="80"/>
@@ -2103,15 +2063,12 @@
     </w:tbl>
     <w:p>
       <w:pPr>
-        <w:spacing w:after="120"/>
+        <w:spacing w:after="120" w:before="100"/>
       </w:pPr>
       <w:r>
         <w:rPr>
-          <w:i/>
-          <w:iCs/>
-          <w:color w:val="555555"/>
-          <w:sz w:val="18"/>
-          <w:szCs w:val="18"/>
+          <w:sz w:val="20"/>
+          <w:szCs w:val="20"/>
         </w:rPr>
         <w:t xml:space="preserve">Los 4 trabajadores se distribuyen así: dirección, operaciones/CRM y dos ejecutivos comerciales. El responsable técnico es quien implementa.</w:t>
       </w:r>
@@ -2223,6 +2180,14 @@
     </w:p>
     <w:p>
       <w:pPr>
+        <w:spacing w:after="120"/>
+      </w:pPr>
+      <w:r>
+        <w:t xml:space="preserve">Los números entre corchetes en el texto remiten a estas fuentes. Donde dice "estimación propia" es un cálculo mío, no un dato verificado.</w:t>
+      </w:r>
+    </w:p>
+    <w:p>
+      <w:pPr>
         <w:pStyle w:val="ListParagraph"/>
         <w:numPr>
           <w:ilvl w:val="0"/>
@@ -2233,12 +2198,12 @@
       <w:r>
         <w:t xml:space="preserve">[1] n8n — Precios (planes Cloud y edición comunitaria). </w:t>
       </w:r>
-      <w:hyperlink w:history="1" r:id="rIdu0hc8hvtwnlmfkl5bmcjn">
+      <w:hyperlink w:history="1" r:id="rIdcgvplgyhkiprwijji5g3i">
         <w:r>
           <w:rPr>
             <w:rStyle w:val="Hyperlink"/>
-            <w:sz w:val="18"/>
-            <w:szCs w:val="18"/>
+            <w:sz w:val="20"/>
+            <w:szCs w:val="20"/>
           </w:rPr>
           <w:t xml:space="preserve">https://n8n.io/pricing/</w:t>
         </w:r>
@@ -2256,12 +2221,12 @@
       <w:r>
         <w:t xml:space="preserve">[2] Meta — Precios de WhatsApp Business Platform. </w:t>
       </w:r>
-      <w:hyperlink w:history="1" r:id="rIdfd_a7rojd5y9x_eiqm4mm">
+      <w:hyperlink w:history="1" r:id="rIdondnmgkhzxnux0_pe3pc0">
         <w:r>
           <w:rPr>
             <w:rStyle w:val="Hyperlink"/>
-            <w:sz w:val="18"/>
-            <w:szCs w:val="18"/>
+            <w:sz w:val="20"/>
+            <w:szCs w:val="20"/>
           </w:rPr>
           <w:t xml:space="preserve">https://developers.facebook.com/documentation/business-messaging/whatsapp/pricing</w:t>
         </w:r>
@@ -2279,12 +2244,12 @@
       <w:r>
         <w:t xml:space="preserve">[3] Brynjolfsson, Li y Raymond — Generative AI at Work, NBER WP 31161. </w:t>
       </w:r>
-      <w:hyperlink w:history="1" r:id="rIdxrwmfogxn5g37hzfhgo8w">
+      <w:hyperlink w:history="1" r:id="rIdhplkqio2zv6pbfsplezmd">
         <w:r>
           <w:rPr>
             <w:rStyle w:val="Hyperlink"/>
-            <w:sz w:val="18"/>
-            <w:szCs w:val="18"/>
+            <w:sz w:val="20"/>
+            <w:szCs w:val="20"/>
           </w:rPr>
           <w:t xml:space="preserve">https://nber.org/papers/w31161</w:t>
         </w:r>
@@ -2302,12 +2267,12 @@
       <w:r>
         <w:t xml:space="preserve">[4] Outlook Business — Gartner: más del 40 % de los proyectos de IA agéntica se cancelarán hacia 2027. </w:t>
       </w:r>
-      <w:hyperlink w:history="1" r:id="rIdicwys0wnxgifwb_-vxrm0">
+      <w:hyperlink w:history="1" r:id="rIdoandbgxxcociogcsiyw2y">
         <w:r>
           <w:rPr>
             <w:rStyle w:val="Hyperlink"/>
-            <w:sz w:val="18"/>
-            <w:szCs w:val="18"/>
+            <w:sz w:val="20"/>
+            <w:szCs w:val="20"/>
           </w:rPr>
           <w:t xml:space="preserve">https://www.outlookbusiness.com/artificial-intelligence/over-40-of-agentic-ai-projects-will-be-scrapped-by-2027-says-gartner</w:t>
         </w:r>
@@ -2325,12 +2290,12 @@
       <w:r>
         <w:t xml:space="preserve">[5] Stealth Agents — Costo de asistentes virtuales en 2026 por región. </w:t>
       </w:r>
-      <w:hyperlink w:history="1" r:id="rIdanurboitnjsqrbsmgjxiv">
+      <w:hyperlink w:history="1" r:id="rIdwiamhomflua0erw5xohvh">
         <w:r>
           <w:rPr>
             <w:rStyle w:val="Hyperlink"/>
-            <w:sz w:val="18"/>
-            <w:szCs w:val="18"/>
+            <w:sz w:val="20"/>
+            <w:szCs w:val="20"/>
           </w:rPr>
           <w:t xml:space="preserve">https://stealthagents.com/research/cost-to-hire-a-virtual-assistant-in-2026-rates-by-region-platform-and-hiring-model</w:t>
         </w:r>
@@ -2348,12 +2313,12 @@
       <w:r>
         <w:t xml:space="preserve">[6] HubSpot — CRM gratuito. </w:t>
       </w:r>
-      <w:hyperlink w:history="1" r:id="rId56eaa-vdqajsrvmzly_zl">
+      <w:hyperlink w:history="1" r:id="rIdxtvc-kxhni4938aje6fwh">
         <w:r>
           <w:rPr>
             <w:rStyle w:val="Hyperlink"/>
-            <w:sz w:val="18"/>
-            <w:szCs w:val="18"/>
+            <w:sz w:val="20"/>
+            <w:szCs w:val="20"/>
           </w:rPr>
           <w:t xml:space="preserve">https://www.hubspot.com/pricing/crm</w:t>
         </w:r>
@@ -2371,12 +2336,12 @@
       <w:r>
         <w:t xml:space="preserve">[7] Prototipo funcional (pregunta 4). </w:t>
       </w:r>
-      <w:hyperlink w:history="1" r:id="rIdjqzx-q3bdltn6mi6jkhk1">
+      <w:hyperlink w:history="1" r:id="rIdus-6kkahwz_ha3k_i3m6v">
         <w:r>
           <w:rPr>
             <w:rStyle w:val="Hyperlink"/>
-            <w:sz w:val="18"/>
-            <w:szCs w:val="18"/>
+            <w:sz w:val="20"/>
+            <w:szCs w:val="20"/>
           </w:rPr>
           <w:t xml:space="preserve">https://github.com/skyze2002/renaser</w:t>
         </w:r>
@@ -2438,21 +2403,12 @@
 <w:ftr xmlns:wpc="http://schemas.microsoft.com/office/word/2010/wordprocessingCanvas" xmlns:mc="http://schemas.openxmlformats.org/markup-compatibility/2006" xmlns:o="urn:schemas-microsoft-com:office:office" xmlns:r="http://schemas.openxmlformats.org/officeDocument/2006/relationships" xmlns:m="http://schemas.openxmlformats.org/officeDocument/2006/math" xmlns:v="urn:schemas-microsoft-com:vml" xmlns:wp14="http://schemas.microsoft.com/office/word/2010/wordprocessingDrawing" xmlns:wp="http://schemas.openxmlformats.org/drawingml/2006/wordprocessingDrawing" xmlns:w10="urn:schemas-microsoft-com:office:word" xmlns:w="http://schemas.openxmlformats.org/wordprocessingml/2006/main" xmlns:w14="http://schemas.microsoft.com/office/word/2010/wordml" xmlns:w15="http://schemas.microsoft.com/office/word/2012/wordml" xmlns:wpg="http://schemas.microsoft.com/office/word/2010/wordprocessingGroup" xmlns:wpi="http://schemas.microsoft.com/office/word/2010/wordprocessingInk" xmlns:wne="http://schemas.microsoft.com/office/word/2006/wordml" xmlns:wps="http://schemas.microsoft.com/office/word/2010/wordprocessingShape">
   <w:p>
     <w:pPr>
-      <w:jc w:val="right"/>
+      <w:jc w:val="center"/>
     </w:pPr>
     <w:r>
       <w:rPr>
-        <w:color w:val="777777"/>
-        <w:sz w:val="16"/>
-        <w:szCs w:val="16"/>
-      </w:rPr>
-      <w:t xml:space="preserve">RENASER · Investigación · </w:t>
-    </w:r>
-    <w:r>
-      <w:rPr>
-        <w:color w:val="777777"/>
-        <w:sz w:val="16"/>
-        <w:szCs w:val="16"/>
+        <w:sz w:val="18"/>
+        <w:szCs w:val="18"/>
       </w:rPr>
       <w:fldChar w:fldCharType="begin"/>
       <w:instrText xml:space="preserve">PAGE</w:instrText>
@@ -2666,9 +2622,9 @@
   <w:docDefaults>
     <w:rPrDefault>
       <w:rPr>
-        <w:rFonts w:ascii="Arial" w:cs="Arial" w:eastAsia="Arial" w:hAnsi="Arial"/>
-        <w:sz w:val="21"/>
-        <w:szCs w:val="21"/>
+        <w:rFonts w:ascii="Calibri" w:cs="Calibri" w:eastAsia="Calibri" w:hAnsi="Calibri"/>
+        <w:sz w:val="22"/>
+        <w:szCs w:val="22"/>
       </w:rPr>
     </w:rPrDefault>
     <w:pPrDefault/>
@@ -2848,12 +2804,12 @@
     <w:name w:val="Title"/>
     <w:basedOn w:val="Normal"/>
     <w:rPr>
-      <w:rFonts w:ascii="Arial" w:cs="Arial" w:eastAsia="Arial" w:hAnsi="Arial"/>
+      <w:rFonts w:ascii="Calibri" w:cs="Calibri" w:eastAsia="Calibri" w:hAnsi="Calibri"/>
       <w:b/>
       <w:bCs/>
-      <w:color w:val="1A1A1A"/>
-      <w:sz w:val="36"/>
-      <w:szCs w:val="36"/>
+      <w:color w:val="000000"/>
+      <w:sz w:val="32"/>
+      <w:szCs w:val="32"/>
     </w:rPr>
   </w:style>
   <w:style w:type="paragraph" w:styleId="Heading1">
@@ -2865,12 +2821,12 @@
       <w:outlineLvl w:val="0"/>
     </w:pPr>
     <w:rPr>
-      <w:rFonts w:ascii="Arial" w:cs="Arial" w:eastAsia="Arial" w:hAnsi="Arial"/>
+      <w:rFonts w:ascii="Calibri" w:cs="Calibri" w:eastAsia="Calibri" w:hAnsi="Calibri"/>
       <w:b/>
       <w:bCs/>
-      <w:color w:val="1F4E79"/>
-      <w:sz w:val="28"/>
-      <w:szCs w:val="28"/>
+      <w:color w:val="000000"/>
+      <w:sz w:val="26"/>
+      <w:szCs w:val="26"/>
     </w:rPr>
   </w:style>
   <w:style w:type="paragraph" w:styleId="Heading2">
@@ -2882,12 +2838,12 @@
       <w:outlineLvl w:val="1"/>
     </w:pPr>
     <w:rPr>
-      <w:rFonts w:ascii="Arial" w:cs="Arial" w:eastAsia="Arial" w:hAnsi="Arial"/>
+      <w:rFonts w:ascii="Calibri" w:cs="Calibri" w:eastAsia="Calibri" w:hAnsi="Calibri"/>
       <w:b/>
       <w:bCs/>
-      <w:color w:val="333333"/>
-      <w:sz w:val="23"/>
-      <w:szCs w:val="23"/>
+      <w:color w:val="000000"/>
+      <w:sz w:val="22"/>
+      <w:szCs w:val="22"/>
     </w:rPr>
   </w:style>
 </w:styles>

</xml_diff>